<commit_message>
Backup pre-integration of SurveyInfoUserControl, SurveyCodeUserControl, ReplicatesUsetControl, FieldTripInfoUserControl and FieldTrip.cs
</commit_message>
<xml_diff>
--- a/Ops Manual/Species List.docx
+++ b/Ops Manual/Species List.docx
@@ -20,6 +20,9 @@
         <w:jc w:val="center"/>
       </w:pPr>
       <w:r>
+        <w:rPr>
+          <w:noProof/>
+        </w:rPr>
         <w:drawing>
           <wp:inline distT="0" distB="0" distL="0" distR="0" wp14:anchorId="267696E8" wp14:editId="55CBC472">
             <wp:extent cx="3425326" cy="4819650"/>
@@ -187,13 +190,7 @@
         <w:t>Species</w:t>
       </w:r>
       <w:r>
-        <w:t xml:space="preserve"> as Latin name/Common name and for the </w:t>
-      </w:r>
-      <w:r>
-        <w:t>Unique Species ID</w:t>
-      </w:r>
-      <w:r>
-        <w:t xml:space="preserve"> to be the ID used by </w:t>
+        <w:t xml:space="preserve"> as Latin name/Common name and for the Unique Species ID to be the ID used by </w:t>
       </w:r>
       <w:hyperlink r:id="rId6" w:history="1">
         <w:proofErr w:type="spellStart"/>
@@ -452,16 +449,7 @@
           <w:i/>
           <w:iCs/>
         </w:rPr>
-        <w:t xml:space="preserve"> </w:t>
-      </w:r>
-      <w:r>
-        <w:rPr>
-          <w:b/>
-          <w:bCs/>
-          <w:i/>
-          <w:iCs/>
-        </w:rPr>
-        <w:t>Unique Species ID</w:t>
+        <w:t xml:space="preserve"> Unique Species ID</w:t>
       </w:r>
       <w:r>
         <w:t xml:space="preserve"> allow the application to automatically download the species images from </w:t>
@@ -1285,6 +1273,7 @@
   <w:style w:type="character" w:default="1" w:styleId="DefaultParagraphFont">
     <w:name w:val="Default Paragraph Font"/>
     <w:uiPriority w:val="1"/>
+    <w:semiHidden/>
     <w:unhideWhenUsed/>
   </w:style>
   <w:style w:type="table" w:default="1" w:styleId="TableNormal">

</xml_diff>